<commit_message>
Trim terminal screenshots to assignment commands only
Co-Authored-By: Claude Sonnet 5 <noreply@anthropic.com>
</commit_message>
<xml_diff>
--- a/Отчёт — Практическое задание 1 (Костин А.).docx
+++ b/Отчёт — Практическое задание 1 (Костин А.).docx
@@ -380,7 +380,7 @@
       <w:r>
         <w:drawing>
           <wp:inline xmlns:a="http://schemas.openxmlformats.org/drawingml/2006/main" xmlns:pic="http://schemas.openxmlformats.org/drawingml/2006/picture">
-            <wp:extent cx="5940000" cy="2247568"/>
+            <wp:extent cx="5940000" cy="761081"/>
             <wp:docPr id="1" name="Picture 1"/>
             <wp:cNvGraphicFramePr>
               <a:graphicFrameLocks noChangeAspect="1"/>
@@ -401,7 +401,7 @@
                   <pic:spPr>
                     <a:xfrm>
                       <a:off x="0" y="0"/>
-                      <a:ext cx="5940000" cy="2247568"/>
+                      <a:ext cx="5940000" cy="761081"/>
                     </a:xfrm>
                     <a:prstGeom prst="rect"/>
                   </pic:spPr>
@@ -441,12 +441,7 @@
     </w:p>
     <w:p>
       <w:r>
-        <w:t>Создана папка проекта, в ней инициализирован локальный репозиторий. Команда git init создаёт служебный каталог .git, в котором Git хранит всю историю изменений.</w:t>
-      </w:r>
-    </w:p>
-    <w:p>
-      <w:r>
-        <w:t>Далее создан файл story.txt с первой строкой. Команда git status показывает его как неотслеживаемый (untracked) — Git видит файл, но ещё не следит за его изменениями. Команда git add переводит файл в индекс (staging area), а git commit фиксирует состояние в истории.</w:t>
+        <w:t>Создана папка проекта, в ней инициализирован локальный репозиторий. Команда git init создаёт служебный каталог .git, в котором Git хранит всю историю изменений. Создан файл story.txt с первой строкой This is the beginning of my story.</w:t>
       </w:r>
     </w:p>
     <w:p>
@@ -470,8 +465,6 @@
         </w:rPr>
         <w:t>git init</w:t>
         <w:br/>
-        <w:t>echo "This is the beginning of my story." &gt; story.txt</w:t>
-        <w:br/>
         <w:t>git add story.txt</w:t>
         <w:br/>
         <w:t>git commit -m "Add first line to the story"</w:t>
@@ -486,7 +479,7 @@
       <w:r>
         <w:drawing>
           <wp:inline xmlns:a="http://schemas.openxmlformats.org/drawingml/2006/main" xmlns:pic="http://schemas.openxmlformats.org/drawingml/2006/picture">
-            <wp:extent cx="5940000" cy="4239529"/>
+            <wp:extent cx="5940000" cy="1602154"/>
             <wp:docPr id="2" name="Picture 2"/>
             <wp:cNvGraphicFramePr>
               <a:graphicFrameLocks noChangeAspect="1"/>
@@ -507,7 +500,7 @@
                   <pic:spPr>
                     <a:xfrm>
                       <a:off x="0" y="0"/>
-                      <a:ext cx="5940000" cy="4239529"/>
+                      <a:ext cx="5940000" cy="1602154"/>
                     </a:xfrm>
                     <a:prstGeom prst="rect"/>
                   </pic:spPr>
@@ -534,7 +527,7 @@
     </w:p>
     <w:p>
       <w:r>
-        <w:t>Затем в файл добавлена вторая строка и сделан второй коммит. Команда git diff, выполненная до индексации, наглядно показывает разницу: первая строка осталась без изменений, а строка It was a dark and stormy night. помечена знаком «+» как добавленная.</w:t>
+        <w:t>Затем в файл добавлена вторая строка It was a dark and stormy night. и сделан второй коммит.</w:t>
       </w:r>
     </w:p>
     <w:p>
@@ -570,7 +563,7 @@
       <w:r>
         <w:drawing>
           <wp:inline xmlns:a="http://schemas.openxmlformats.org/drawingml/2006/main" xmlns:pic="http://schemas.openxmlformats.org/drawingml/2006/picture">
-            <wp:extent cx="5940000" cy="4112811"/>
+            <wp:extent cx="5940000" cy="1165733"/>
             <wp:docPr id="3" name="Picture 3"/>
             <wp:cNvGraphicFramePr>
               <a:graphicFrameLocks noChangeAspect="1"/>
@@ -591,7 +584,7 @@
                   <pic:spPr>
                     <a:xfrm>
                       <a:off x="0" y="0"/>
-                      <a:ext cx="5940000" cy="4112811"/>
+                      <a:ext cx="5940000" cy="1165733"/>
                     </a:xfrm>
                     <a:prstGeom prst="rect"/>
                   </pic:spPr>
@@ -613,7 +606,7 @@
           <w:color w:val="555555"/>
           <w:sz w:val="21"/>
         </w:rPr>
-        <w:t>Рисунок 3 — Второй коммит и просмотр изменений через git diff</w:t>
+        <w:t>Рисунок 3 — Второй коммит в ветке main</w:t>
       </w:r>
     </w:p>
     <w:p>
@@ -626,7 +619,7 @@
     </w:p>
     <w:p>
       <w:r>
-        <w:t>Создана ветка test и выполнено переключение на неё. Ветка в Git представляет собой подвижный указатель на коммит; команда git branch выводит список веток, звёздочкой отмечена текущая. В ветке test вторая строка заменена на «солнечный» вариант, после чего сделан коммит.</w:t>
+        <w:t>Создана ветка test и выполнено переключение на неё. Ветка в Git представляет собой подвижный указатель на коммит. В ветке test вторая строка заменена на «солнечный» вариант And the sun was shining brightly., после чего сделан коммит.</w:t>
       </w:r>
     </w:p>
     <w:p>
@@ -666,7 +659,7 @@
       <w:r>
         <w:drawing>
           <wp:inline xmlns:a="http://schemas.openxmlformats.org/drawingml/2006/main" xmlns:pic="http://schemas.openxmlformats.org/drawingml/2006/picture">
-            <wp:extent cx="5940000" cy="3203596"/>
+            <wp:extent cx="5940000" cy="1535056"/>
             <wp:docPr id="4" name="Picture 4"/>
             <wp:cNvGraphicFramePr>
               <a:graphicFrameLocks noChangeAspect="1"/>
@@ -687,7 +680,7 @@
                   <pic:spPr>
                     <a:xfrm>
                       <a:off x="0" y="0"/>
-                      <a:ext cx="5940000" cy="3203596"/>
+                      <a:ext cx="5940000" cy="1535056"/>
                     </a:xfrm>
                     <a:prstGeom prst="rect"/>
                   </pic:spPr>
@@ -714,12 +707,7 @@
     </w:p>
     <w:p>
       <w:r>
-        <w:t>После возврата в ветку main командой git checkout main файл story.txt автоматически принял вид, соответствующий этой ветке: вторая строка снова стала It was a dark and stormy night. Это ключевая особенность веток — рабочий каталог перестраивается под выбранную ветку.</w:t>
-      </w:r>
-    </w:p>
-    <w:p>
-      <w:r>
-        <w:t>Затем та же самая вторая строка была изменена по-другому — на драматичный вариант. Именно изменение одного и того же места файла в двух разных ветках и создаёт конфликт при последующем слиянии.</w:t>
+        <w:t>После возврата в ветку main командой git checkout main файл story.txt автоматически принял вид, соответствующий этой ветке. Затем та же самая вторая строка была изменена по-другому — на драматичный вариант Suddenly, a shot rang out! Именно изменение одного и того же места файла в двух разных ветках и создаёт конфликт при последующем слиянии.</w:t>
       </w:r>
     </w:p>
     <w:p>
@@ -746,8 +734,6 @@
         <w:t>git add story.txt</w:t>
         <w:br/>
         <w:t>git commit -m "Make the story more dramatic"</w:t>
-        <w:br/>
-        <w:t>git log --oneline --graph --all</w:t>
       </w:r>
     </w:p>
     <w:p>
@@ -759,7 +745,7 @@
       <w:r>
         <w:drawing>
           <wp:inline xmlns:a="http://schemas.openxmlformats.org/drawingml/2006/main" xmlns:pic="http://schemas.openxmlformats.org/drawingml/2006/picture">
-            <wp:extent cx="5940000" cy="4179763"/>
+            <wp:extent cx="5940000" cy="1459397"/>
             <wp:docPr id="5" name="Picture 5"/>
             <wp:cNvGraphicFramePr>
               <a:graphicFrameLocks noChangeAspect="1"/>
@@ -780,7 +766,7 @@
                   <pic:spPr>
                     <a:xfrm>
                       <a:off x="0" y="0"/>
-                      <a:ext cx="5940000" cy="4179763"/>
+                      <a:ext cx="5940000" cy="1459397"/>
                     </a:xfrm>
                     <a:prstGeom prst="rect"/>
                   </pic:spPr>
@@ -838,12 +824,6 @@
           <w:sz w:val="21"/>
         </w:rPr>
         <w:t>git merge test</w:t>
-        <w:br/>
-        <w:t>КОНФЛИКТ (содержимое): Конфликт слияния в story.txt</w:t>
-        <w:br/>
-        <w:t>Сбой автоматического слияния; исправьте конфликты,</w:t>
-        <w:br/>
-        <w:t>затем зафиксируйте результат.</w:t>
       </w:r>
     </w:p>
     <w:p>
@@ -855,7 +835,7 @@
       <w:r>
         <w:drawing>
           <wp:inline xmlns:a="http://schemas.openxmlformats.org/drawingml/2006/main" xmlns:pic="http://schemas.openxmlformats.org/drawingml/2006/picture">
-            <wp:extent cx="5940000" cy="4650485"/>
+            <wp:extent cx="5940000" cy="1220924"/>
             <wp:docPr id="6" name="Picture 6"/>
             <wp:cNvGraphicFramePr>
               <a:graphicFrameLocks noChangeAspect="1"/>
@@ -876,7 +856,7 @@
                   <pic:spPr>
                     <a:xfrm>
                       <a:off x="0" y="0"/>
-                      <a:ext cx="5940000" cy="4650485"/>
+                      <a:ext cx="5940000" cy="1220924"/>
                     </a:xfrm>
                     <a:prstGeom prst="rect"/>
                   </pic:spPr>
@@ -898,12 +878,12 @@
           <w:color w:val="555555"/>
           <w:sz w:val="21"/>
         </w:rPr>
-        <w:t>Рисунок 6 — Конфликт слияния: сообщение Git, статус и сигнатура конфликта в файле</w:t>
+        <w:t>Рисунок 6 — Конфликт слияния: сообщение Git</w:t>
       </w:r>
     </w:p>
     <w:p>
       <w:r>
-        <w:t>Команда git status показывает файл в состоянии «оба изменены» (both modified), а сам файл размечен сигнатурой конфликта:</w:t>
+        <w:t>Файл story.txt был размечен сигнатурой конфликта:</w:t>
       </w:r>
     </w:p>
     <w:p>
@@ -945,7 +925,7 @@
     </w:p>
     <w:p>
       <w:r>
-        <w:t>Конфликт разрешён объединением обоих вариантов в одно предложение, все служебные маркеры удалены. После этого исправленный файл добавлен в индекс — команда git add служит для Git сигналом «конфликт разрешён», — и слияние завершено коммитом.</w:t>
+        <w:t>Конфликт разрешён объединением обоих вариантов в одно предложение, все служебные маркеры удалены. После этого исправленный файл добавлен в индекс, и слияние завершено коммитом.</w:t>
       </w:r>
     </w:p>
     <w:p>
@@ -981,7 +961,7 @@
       <w:r>
         <w:drawing>
           <wp:inline xmlns:a="http://schemas.openxmlformats.org/drawingml/2006/main" xmlns:pic="http://schemas.openxmlformats.org/drawingml/2006/picture">
-            <wp:extent cx="5940000" cy="3133701"/>
+            <wp:extent cx="5940000" cy="795118"/>
             <wp:docPr id="7" name="Picture 7"/>
             <wp:cNvGraphicFramePr>
               <a:graphicFrameLocks noChangeAspect="1"/>
@@ -1002,7 +982,7 @@
                   <pic:spPr>
                     <a:xfrm>
                       <a:off x="0" y="0"/>
-                      <a:ext cx="5940000" cy="3133701"/>
+                      <a:ext cx="5940000" cy="795118"/>
                     </a:xfrm>
                     <a:prstGeom prst="rect"/>
                   </pic:spPr>
@@ -1024,7 +1004,7 @@
           <w:color w:val="555555"/>
           <w:sz w:val="21"/>
         </w:rPr>
-        <w:t>Рисунок 7 — Разрешение конфликта и завершение слияния коммитом</w:t>
+        <w:t>Рисунок 7 — Завершение слияния коммитом</w:t>
       </w:r>
     </w:p>
     <w:p>
@@ -1095,7 +1075,7 @@
       <w:r>
         <w:drawing>
           <wp:inline xmlns:a="http://schemas.openxmlformats.org/drawingml/2006/main" xmlns:pic="http://schemas.openxmlformats.org/drawingml/2006/picture">
-            <wp:extent cx="5940000" cy="3133701"/>
+            <wp:extent cx="5940000" cy="2077132"/>
             <wp:docPr id="8" name="Picture 8"/>
             <wp:cNvGraphicFramePr>
               <a:graphicFrameLocks noChangeAspect="1"/>
@@ -1116,7 +1096,7 @@
                   <pic:spPr>
                     <a:xfrm>
                       <a:off x="0" y="0"/>
-                      <a:ext cx="5940000" cy="3133701"/>
+                      <a:ext cx="5940000" cy="2077132"/>
                     </a:xfrm>
                     <a:prstGeom prst="rect"/>
                   </pic:spPr>
@@ -1156,7 +1136,7 @@
     </w:p>
     <w:p>
       <w:r>
-        <w:t>Локальный репозиторий привязан к удалённому и отправлен на GitHub. Флаг -u устанавливает связь между локальной веткой main и удалённой origin/main, благодаря чему в дальнейшем достаточно короткой команды git push. Дополнительно отправлена ветка test, чтобы ветвление было видно и на GitHub.</w:t>
+        <w:t>Локальный репозиторий привязан к удалённому и отправлен на GitHub. Флаг -u устанавливает связь между локальной веткой main и удалённой origin/main.</w:t>
       </w:r>
     </w:p>
     <w:p>
@@ -1181,8 +1161,6 @@
         <w:t>git remote add origin https://github.com/Asw3x/mireaanotherpne.git</w:t>
         <w:br/>
         <w:t>git push -u origin main</w:t>
-        <w:br/>
-        <w:t>git push origin test</w:t>
       </w:r>
     </w:p>
     <w:p>
@@ -1194,7 +1172,7 @@
       <w:r>
         <w:drawing>
           <wp:inline xmlns:a="http://schemas.openxmlformats.org/drawingml/2006/main" xmlns:pic="http://schemas.openxmlformats.org/drawingml/2006/picture">
-            <wp:extent cx="5940000" cy="3492905"/>
+            <wp:extent cx="5940000" cy="1045811"/>
             <wp:docPr id="9" name="Picture 9"/>
             <wp:cNvGraphicFramePr>
               <a:graphicFrameLocks noChangeAspect="1"/>
@@ -1215,7 +1193,7 @@
                   <pic:spPr>
                     <a:xfrm>
                       <a:off x="0" y="0"/>
-                      <a:ext cx="5940000" cy="3492905"/>
+                      <a:ext cx="5940000" cy="1045811"/>
                     </a:xfrm>
                     <a:prstGeom prst="rect"/>
                   </pic:spPr>
@@ -1237,7 +1215,7 @@
           <w:color w:val="555555"/>
           <w:sz w:val="21"/>
         </w:rPr>
-        <w:t>Рисунок 9 — Привязка удалённого репозитория и отправка веток</w:t>
+        <w:t>Рисунок 9 — Привязка удалённого репозитория и отправка ветки main</w:t>
       </w:r>
     </w:p>
     <w:p>
@@ -1493,7 +1471,7 @@
     </w:p>
     <w:p>
       <w:r>
-        <w:t>Отдельно отработана синхронизация с удалённым репозиторием: связывание локального проекта с GitHub командой git remote add и отправка веток командой git push.</w:t>
+        <w:t>Отдельно отработана синхронизация с удалённым репозиторием: связывание локального проекта с GitHub командой git remote add и отправка ветки командой git push.</w:t>
       </w:r>
     </w:p>
     <w:p>
@@ -1654,45 +1632,6 @@
                 <w:rFonts w:ascii="Consolas" w:hAnsi="Consolas" w:eastAsia="Consolas"/>
                 <w:sz w:val="21"/>
               </w:rPr>
-              <w:t>git status</w:t>
-            </w:r>
-          </w:p>
-        </w:tc>
-        <w:tc>
-          <w:tcPr>
-            <w:tcW w:type="dxa" w:w="5669"/>
-          </w:tcPr>
-          <w:p>
-            <w:pPr>
-              <w:spacing w:after="40"/>
-              <w:jc w:val="left"/>
-            </w:pPr>
-            <w:r/>
-            <w:r>
-              <w:rPr>
-                <w:sz w:val="22"/>
-              </w:rPr>
-              <w:t>состояние рабочего каталога и индекса</w:t>
-            </w:r>
-          </w:p>
-        </w:tc>
-      </w:tr>
-      <w:tr>
-        <w:tc>
-          <w:tcPr>
-            <w:tcW w:type="dxa" w:w="3685"/>
-          </w:tcPr>
-          <w:p>
-            <w:pPr>
-              <w:spacing w:after="40"/>
-              <w:jc w:val="left"/>
-            </w:pPr>
-            <w:r/>
-            <w:r>
-              <w:rPr>
-                <w:rFonts w:ascii="Consolas" w:hAnsi="Consolas" w:eastAsia="Consolas"/>
-                <w:sz w:val="21"/>
-              </w:rPr>
               <w:t>git add &lt;файл&gt;</w:t>
             </w:r>
           </w:p>
@@ -1771,45 +1710,6 @@
                 <w:rFonts w:ascii="Consolas" w:hAnsi="Consolas" w:eastAsia="Consolas"/>
                 <w:sz w:val="21"/>
               </w:rPr>
-              <w:t>git diff</w:t>
-            </w:r>
-          </w:p>
-        </w:tc>
-        <w:tc>
-          <w:tcPr>
-            <w:tcW w:type="dxa" w:w="5669"/>
-          </w:tcPr>
-          <w:p>
-            <w:pPr>
-              <w:spacing w:after="40"/>
-              <w:jc w:val="left"/>
-            </w:pPr>
-            <w:r/>
-            <w:r>
-              <w:rPr>
-                <w:sz w:val="22"/>
-              </w:rPr>
-              <w:t>просмотр изменений до индексации</w:t>
-            </w:r>
-          </w:p>
-        </w:tc>
-      </w:tr>
-      <w:tr>
-        <w:tc>
-          <w:tcPr>
-            <w:tcW w:type="dxa" w:w="3685"/>
-          </w:tcPr>
-          <w:p>
-            <w:pPr>
-              <w:spacing w:after="40"/>
-              <w:jc w:val="left"/>
-            </w:pPr>
-            <w:r/>
-            <w:r>
-              <w:rPr>
-                <w:rFonts w:ascii="Consolas" w:hAnsi="Consolas" w:eastAsia="Consolas"/>
-                <w:sz w:val="21"/>
-              </w:rPr>
               <w:t>git branch &lt;имя&gt;</w:t>
             </w:r>
           </w:p>
@@ -1828,7 +1728,7 @@
               <w:rPr>
                 <w:sz w:val="22"/>
               </w:rPr>
-              <w:t>список веток / создание новой ветки</w:t>
+              <w:t>создание новой ветки</w:t>
             </w:r>
           </w:p>
         </w:tc>

</xml_diff>

<commit_message>
Add editor screenshot showing conflict markers in story.txt
Co-Authored-By: Claude Sonnet 5 <noreply@anthropic.com>
</commit_message>
<xml_diff>
--- a/Отчёт — Практическое задание 1 (Костин А.).docx
+++ b/Отчёт — Практическое задание 1 (Костин А.).docx
@@ -883,39 +883,62 @@
     </w:p>
     <w:p>
       <w:r>
-        <w:t>Файл story.txt был размечен сигнатурой конфликта:</w:t>
+        <w:t>Файл story.txt был открыт в текстовом редакторе — он размечен сигнатурой конфликта, и нужно выбрать (или объединить) один из двух вариантов:</w:t>
       </w:r>
     </w:p>
     <w:p>
       <w:pPr>
-        <w:keepLines/>
-        <w:spacing w:before="160" w:after="200" w:line="240" w:lineRule="auto"/>
-        <w:ind w:left="170" w:right="170"/>
-        <w:jc w:val="left"/>
-        <w:shd w:val="clear" w:color="auto" w:fill="F2F3F5"/>
-        <w:pBdr>
-          <w:top w:val="single" w:sz="4" w:space="4" w:color="D5D8DD"/>
-          <w:left w:val="single" w:sz="4" w:space="4" w:color="D5D8DD"/>
-          <w:bottom w:val="single" w:sz="4" w:space="4" w:color="D5D8DD"/>
-          <w:right w:val="single" w:sz="4" w:space="4" w:color="D5D8DD"/>
-        </w:pBdr>
+        <w:keepNext/>
+        <w:spacing w:before="160" w:after="40"/>
+        <w:jc w:val="center"/>
+      </w:pPr>
+      <w:r>
+        <w:drawing>
+          <wp:inline xmlns:a="http://schemas.openxmlformats.org/drawingml/2006/main" xmlns:pic="http://schemas.openxmlformats.org/drawingml/2006/picture">
+            <wp:extent cx="5940000" cy="2072681"/>
+            <wp:docPr id="7" name="Picture 7"/>
+            <wp:cNvGraphicFramePr>
+              <a:graphicFrameLocks noChangeAspect="1"/>
+            </wp:cNvGraphicFramePr>
+            <a:graphic>
+              <a:graphicData uri="http://schemas.openxmlformats.org/drawingml/2006/picture">
+                <pic:pic>
+                  <pic:nvPicPr>
+                    <pic:cNvPr id="0" name="07-conflict-file.png"/>
+                    <pic:cNvPicPr/>
+                  </pic:nvPicPr>
+                  <pic:blipFill>
+                    <a:blip r:embed="rId15"/>
+                    <a:stretch>
+                      <a:fillRect/>
+                    </a:stretch>
+                  </pic:blipFill>
+                  <pic:spPr>
+                    <a:xfrm>
+                      <a:off x="0" y="0"/>
+                      <a:ext cx="5940000" cy="2072681"/>
+                    </a:xfrm>
+                    <a:prstGeom prst="rect"/>
+                  </pic:spPr>
+                </pic:pic>
+              </a:graphicData>
+            </a:graphic>
+          </wp:inline>
+        </w:drawing>
+      </w:r>
+    </w:p>
+    <w:p>
+      <w:pPr>
+        <w:spacing w:after="240"/>
+        <w:jc w:val="center"/>
       </w:pPr>
       <w:r>
         <w:rPr>
-          <w:rFonts w:ascii="Consolas" w:hAnsi="Consolas" w:eastAsia="Consolas"/>
+          <w:i/>
+          <w:color w:val="555555"/>
           <w:sz w:val="21"/>
         </w:rPr>
-        <w:t>This is the beginning of my story.</w:t>
-        <w:br/>
-        <w:t>&lt;&lt;&lt;&lt;&lt;&lt;&lt; HEAD</w:t>
-        <w:br/>
-        <w:t>Suddenly, a shot rang out!</w:t>
-        <w:br/>
-        <w:t>=======</w:t>
-        <w:br/>
-        <w:t>And the sun was shining brightly.</w:t>
-        <w:br/>
-        <w:t>&gt;&gt;&gt;&gt;&gt;&gt;&gt; test</w:t>
+        <w:t>Рисунок 7 — story.txt с сигнатурой конфликта: зелёным выделена текущая версия (HEAD, main), синим — входящая версия (test)</w:t>
       </w:r>
     </w:p>
     <w:p>
@@ -962,7 +985,7 @@
         <w:drawing>
           <wp:inline xmlns:a="http://schemas.openxmlformats.org/drawingml/2006/main" xmlns:pic="http://schemas.openxmlformats.org/drawingml/2006/picture">
             <wp:extent cx="5940000" cy="795118"/>
-            <wp:docPr id="7" name="Picture 7"/>
+            <wp:docPr id="8" name="Picture 8"/>
             <wp:cNvGraphicFramePr>
               <a:graphicFrameLocks noChangeAspect="1"/>
             </wp:cNvGraphicFramePr>
@@ -970,11 +993,11 @@
               <a:graphicData uri="http://schemas.openxmlformats.org/drawingml/2006/picture">
                 <pic:pic>
                   <pic:nvPicPr>
-                    <pic:cNvPr id="0" name="07-conflict-resolved.png"/>
+                    <pic:cNvPr id="0" name="08-conflict-resolved.png"/>
                     <pic:cNvPicPr/>
                   </pic:nvPicPr>
                   <pic:blipFill>
-                    <a:blip r:embed="rId15"/>
+                    <a:blip r:embed="rId16"/>
                     <a:stretch>
                       <a:fillRect/>
                     </a:stretch>
@@ -1004,7 +1027,7 @@
           <w:color w:val="555555"/>
           <w:sz w:val="21"/>
         </w:rPr>
-        <w:t>Рисунок 7 — Завершение слияния коммитом</w:t>
+        <w:t>Рисунок 8 — Завершение слияния коммитом</w:t>
       </w:r>
     </w:p>
     <w:p>
@@ -1076,7 +1099,7 @@
         <w:drawing>
           <wp:inline xmlns:a="http://schemas.openxmlformats.org/drawingml/2006/main" xmlns:pic="http://schemas.openxmlformats.org/drawingml/2006/picture">
             <wp:extent cx="5940000" cy="2077132"/>
-            <wp:docPr id="8" name="Picture 8"/>
+            <wp:docPr id="9" name="Picture 9"/>
             <wp:cNvGraphicFramePr>
               <a:graphicFrameLocks noChangeAspect="1"/>
             </wp:cNvGraphicFramePr>
@@ -1084,11 +1107,11 @@
               <a:graphicData uri="http://schemas.openxmlformats.org/drawingml/2006/picture">
                 <pic:pic>
                   <pic:nvPicPr>
-                    <pic:cNvPr id="0" name="09-git-log-graph.png"/>
+                    <pic:cNvPr id="0" name="10-git-log-graph.png"/>
                     <pic:cNvPicPr/>
                   </pic:nvPicPr>
                   <pic:blipFill>
-                    <a:blip r:embed="rId16"/>
+                    <a:blip r:embed="rId17"/>
                     <a:stretch>
                       <a:fillRect/>
                     </a:stretch>
@@ -1118,7 +1141,7 @@
           <w:color w:val="555555"/>
           <w:sz w:val="21"/>
         </w:rPr>
-        <w:t>Рисунок 8 — Граф истории: ветвление и коммит слияния</w:t>
+        <w:t>Рисунок 9 — Граф истории: ветвление и коммит слияния</w:t>
       </w:r>
     </w:p>
     <w:p>
@@ -1173,7 +1196,7 @@
         <w:drawing>
           <wp:inline xmlns:a="http://schemas.openxmlformats.org/drawingml/2006/main" xmlns:pic="http://schemas.openxmlformats.org/drawingml/2006/picture">
             <wp:extent cx="5940000" cy="1045811"/>
-            <wp:docPr id="9" name="Picture 9"/>
+            <wp:docPr id="10" name="Picture 10"/>
             <wp:cNvGraphicFramePr>
               <a:graphicFrameLocks noChangeAspect="1"/>
             </wp:cNvGraphicFramePr>
@@ -1181,11 +1204,11 @@
               <a:graphicData uri="http://schemas.openxmlformats.org/drawingml/2006/picture">
                 <pic:pic>
                   <pic:nvPicPr>
-                    <pic:cNvPr id="0" name="08-push-github.png"/>
+                    <pic:cNvPr id="0" name="09-push-github.png"/>
                     <pic:cNvPicPr/>
                   </pic:nvPicPr>
                   <pic:blipFill>
-                    <a:blip r:embed="rId17"/>
+                    <a:blip r:embed="rId18"/>
                     <a:stretch>
                       <a:fillRect/>
                     </a:stretch>
@@ -1215,7 +1238,7 @@
           <w:color w:val="555555"/>
           <w:sz w:val="21"/>
         </w:rPr>
-        <w:t>Рисунок 9 — Привязка удалённого репозитория и отправка ветки main</w:t>
+        <w:t>Рисунок 10 — Привязка удалённого репозитория и отправка ветки main</w:t>
       </w:r>
     </w:p>
     <w:p>
@@ -1241,7 +1264,7 @@
         <w:drawing>
           <wp:inline xmlns:a="http://schemas.openxmlformats.org/drawingml/2006/main" xmlns:pic="http://schemas.openxmlformats.org/drawingml/2006/picture">
             <wp:extent cx="5940000" cy="2743125"/>
-            <wp:docPr id="10" name="Picture 10"/>
+            <wp:docPr id="11" name="Picture 11"/>
             <wp:cNvGraphicFramePr>
               <a:graphicFrameLocks noChangeAspect="1"/>
             </wp:cNvGraphicFramePr>
@@ -1249,11 +1272,11 @@
               <a:graphicData uri="http://schemas.openxmlformats.org/drawingml/2006/picture">
                 <pic:pic>
                   <pic:nvPicPr>
-                    <pic:cNvPr id="0" name="10-github-repo.png"/>
+                    <pic:cNvPr id="0" name="11-github-repo.png"/>
                     <pic:cNvPicPr/>
                   </pic:nvPicPr>
                   <pic:blipFill>
-                    <a:blip r:embed="rId18"/>
+                    <a:blip r:embed="rId19"/>
                     <a:stretch>
                       <a:fillRect/>
                     </a:stretch>
@@ -1283,7 +1306,7 @@
           <w:color w:val="555555"/>
           <w:sz w:val="21"/>
         </w:rPr>
-        <w:t>Рисунок 10 — Главная страница репозитория на GitHub</w:t>
+        <w:t>Рисунок 11 — Главная страница репозитория на GitHub</w:t>
       </w:r>
     </w:p>
     <w:p>
@@ -1296,7 +1319,7 @@
         <w:drawing>
           <wp:inline xmlns:a="http://schemas.openxmlformats.org/drawingml/2006/main" xmlns:pic="http://schemas.openxmlformats.org/drawingml/2006/picture">
             <wp:extent cx="5940000" cy="2912250"/>
-            <wp:docPr id="11" name="Picture 11"/>
+            <wp:docPr id="12" name="Picture 12"/>
             <wp:cNvGraphicFramePr>
               <a:graphicFrameLocks noChangeAspect="1"/>
             </wp:cNvGraphicFramePr>
@@ -1304,11 +1327,11 @@
               <a:graphicData uri="http://schemas.openxmlformats.org/drawingml/2006/picture">
                 <pic:pic>
                   <pic:nvPicPr>
-                    <pic:cNvPr id="0" name="11-github-commits.png"/>
+                    <pic:cNvPr id="0" name="12-github-commits.png"/>
                     <pic:cNvPicPr/>
                   </pic:nvPicPr>
                   <pic:blipFill>
-                    <a:blip r:embed="rId19"/>
+                    <a:blip r:embed="rId20"/>
                     <a:stretch>
                       <a:fillRect/>
                     </a:stretch>
@@ -1338,7 +1361,7 @@
           <w:color w:val="555555"/>
           <w:sz w:val="21"/>
         </w:rPr>
-        <w:t>Рисунок 11 — История коммитов на GitHub: все пять шагов работы</w:t>
+        <w:t>Рисунок 12 — История коммитов на GitHub: все пять шагов работы</w:t>
       </w:r>
     </w:p>
     <w:p>
@@ -1351,7 +1374,7 @@
         <w:drawing>
           <wp:inline xmlns:a="http://schemas.openxmlformats.org/drawingml/2006/main" xmlns:pic="http://schemas.openxmlformats.org/drawingml/2006/picture">
             <wp:extent cx="5940000" cy="1794375"/>
-            <wp:docPr id="12" name="Picture 12"/>
+            <wp:docPr id="13" name="Picture 13"/>
             <wp:cNvGraphicFramePr>
               <a:graphicFrameLocks noChangeAspect="1"/>
             </wp:cNvGraphicFramePr>
@@ -1359,11 +1382,11 @@
               <a:graphicData uri="http://schemas.openxmlformats.org/drawingml/2006/picture">
                 <pic:pic>
                   <pic:nvPicPr>
-                    <pic:cNvPr id="0" name="12-github-story-txt.png"/>
+                    <pic:cNvPr id="0" name="13-github-story-txt.png"/>
                     <pic:cNvPicPr/>
                   </pic:nvPicPr>
                   <pic:blipFill>
-                    <a:blip r:embed="rId20"/>
+                    <a:blip r:embed="rId21"/>
                     <a:stretch>
                       <a:fillRect/>
                     </a:stretch>
@@ -1393,7 +1416,7 @@
           <w:color w:val="555555"/>
           <w:sz w:val="21"/>
         </w:rPr>
-        <w:t>Рисунок 12 — Итоговое содержимое story.txt после разрешения конфликта</w:t>
+        <w:t>Рисунок 13 — Итоговое содержимое story.txt после разрешения конфликта</w:t>
       </w:r>
     </w:p>
     <w:p>
@@ -1406,7 +1429,7 @@
         <w:drawing>
           <wp:inline xmlns:a="http://schemas.openxmlformats.org/drawingml/2006/main" xmlns:pic="http://schemas.openxmlformats.org/drawingml/2006/picture">
             <wp:extent cx="5940000" cy="2673000"/>
-            <wp:docPr id="13" name="Picture 13"/>
+            <wp:docPr id="14" name="Picture 14"/>
             <wp:cNvGraphicFramePr>
               <a:graphicFrameLocks noChangeAspect="1"/>
             </wp:cNvGraphicFramePr>
@@ -1414,11 +1437,11 @@
               <a:graphicData uri="http://schemas.openxmlformats.org/drawingml/2006/picture">
                 <pic:pic>
                   <pic:nvPicPr>
-                    <pic:cNvPr id="0" name="13-github-branches.png"/>
+                    <pic:cNvPr id="0" name="14-github-branches.png"/>
                     <pic:cNvPicPr/>
                   </pic:nvPicPr>
                   <pic:blipFill>
-                    <a:blip r:embed="rId21"/>
+                    <a:blip r:embed="rId22"/>
                     <a:stretch>
                       <a:fillRect/>
                     </a:stretch>
@@ -1448,7 +1471,7 @@
           <w:color w:val="555555"/>
           <w:sz w:val="21"/>
         </w:rPr>
-        <w:t>Рисунок 13 — Список веток: обе ветки, main и test, присутствуют в репозитории</w:t>
+        <w:t>Рисунок 14 — Список веток: обе ветки, main и test, присутствуют в репозитории</w:t>
       </w:r>
     </w:p>
     <w:p>

</xml_diff>